<commit_message>
docs(tde3): nota sobre ArchUnitTS e copia do documento em output/
- explica que os backends sao TypeScript, entao apenas ArchUnitTS se aplica
- evita paragrafo orfao antes dos blocos de codigo
- copia do DOCX/PDF em output/ seguindo o padrao da entrega anterior
</commit_message>
<xml_diff>
--- a/docs/evidencias/tde3/TDE3-Vertical-Slice-Clean-Architecture-ArchUnitTS.docx
+++ b/docs/evidencias/tde3/TDE3-Vertical-Slice-Clean-Architecture-ArchUnitTS.docx
@@ -4650,6 +4650,7 @@
     </w:tbl>
     <w:p>
       <w:pPr>
+        <w:keepNext/>
         <w:spacing w:after="120" w:before="200" w:line="276"/>
       </w:pPr>
       <w:r>
@@ -4714,6 +4715,7 @@
     </w:p>
     <w:p>
       <w:pPr>
+        <w:keepNext/>
         <w:spacing w:after="120" w:before="0" w:line="276"/>
       </w:pPr>
       <w:r>
@@ -4843,6 +4845,18 @@
           <w:szCs w:val="22"/>
         </w:rPr>
         <w:t xml:space="preserve">O ArchUnitTS é o equivalente do ArchUnit para TypeScript. A ferramenta analisa o grafo de imports a partir do tsconfig e valida regras declarativas. Nesta entrega foi usada a versão 2.5.4 (pacote archunit), integrada ao Vitest já existente em cada projeto.</w:t>
+      </w:r>
+    </w:p>
+    <w:p>
+      <w:pPr>
+        <w:spacing w:after="120" w:before="0" w:line="276"/>
+      </w:pPr>
+      <w:r>
+        <w:rPr>
+          <w:sz w:val="22"/>
+          <w:szCs w:val="22"/>
+        </w:rPr>
+        <w:t xml:space="preserve">Os quatro backends do projeto são TypeScript, então a ferramenta correspondente é o ArchUnitTS. Não há projeto Java, C# ou Python neste repositório, portanto ArchUnit, ArchUnit.Net e PyTestArch não se aplicam.</w:t>
       </w:r>
     </w:p>
     <w:tbl>
@@ -5705,6 +5719,7 @@
     </w:tbl>
     <w:p>
       <w:pPr>
+        <w:keepNext/>
         <w:spacing w:after="120" w:before="200" w:line="276"/>
       </w:pPr>
       <w:r>
@@ -6281,6 +6296,7 @@
     </w:p>
     <w:p>
       <w:pPr>
+        <w:keepNext/>
         <w:spacing w:after="120" w:before="0" w:line="276"/>
       </w:pPr>
       <w:r>

</xml_diff>